<commit_message>
historias de usuarios scrum
</commit_message>
<xml_diff>
--- a/01 Documentación/Scrum/Sprint I/EcoWaste_Historias de usuario Sprint I.docx
+++ b/01 Documentación/Scrum/Sprint I/EcoWaste_Historias de usuario Sprint I.docx
@@ -1074,6 +1074,9 @@
               <w:jc w:val="center"/>
             </w:pPr>
             <w:r>
+              <w:rPr>
+                <w:noProof/>
+              </w:rPr>
               <w:drawing>
                 <wp:inline distT="0" distB="0" distL="0" distR="0" wp14:anchorId="037CA5BD" wp14:editId="5FEEE42D">
                   <wp:extent cx="6332220" cy="4041775"/>
@@ -1116,6 +1119,9 @@
               <w:jc w:val="center"/>
             </w:pPr>
             <w:r>
+              <w:rPr>
+                <w:noProof/>
+              </w:rPr>
               <w:lastRenderedPageBreak/>
               <w:drawing>
                 <wp:inline distT="0" distB="0" distL="0" distR="0" wp14:anchorId="25AB10EF" wp14:editId="2EB5660F">
@@ -1804,6 +1810,9 @@
               <w:jc w:val="center"/>
             </w:pPr>
             <w:r>
+              <w:rPr>
+                <w:noProof/>
+              </w:rPr>
               <w:drawing>
                 <wp:inline distT="0" distB="0" distL="0" distR="0" wp14:anchorId="5E083575" wp14:editId="7BF7B001">
                   <wp:extent cx="6332220" cy="4163060"/>
@@ -1846,7 +1855,84 @@
               <w:jc w:val="center"/>
             </w:pPr>
             <w:r>
+              <w:rPr>
+                <w:noProof/>
+              </w:rPr>
               <w:lastRenderedPageBreak/>
+              <mc:AlternateContent>
+                <mc:Choice Requires="wps">
+                  <w:drawing>
+                    <wp:anchor distT="0" distB="0" distL="114300" distR="114300" simplePos="0" relativeHeight="251660288" behindDoc="0" locked="0" layoutInCell="1" allowOverlap="1" wp14:anchorId="47307A53" wp14:editId="37D48919">
+                      <wp:simplePos x="0" y="0"/>
+                      <wp:positionH relativeFrom="column">
+                        <wp:posOffset>3962400</wp:posOffset>
+                      </wp:positionH>
+                      <wp:positionV relativeFrom="paragraph">
+                        <wp:posOffset>3077210</wp:posOffset>
+                      </wp:positionV>
+                      <wp:extent cx="1303020" cy="175260"/>
+                      <wp:effectExtent l="0" t="0" r="11430" b="15240"/>
+                      <wp:wrapNone/>
+                      <wp:docPr id="233051706" name="Rectángulo 2"/>
+                      <wp:cNvGraphicFramePr/>
+                      <a:graphic xmlns:a="http://schemas.openxmlformats.org/drawingml/2006/main">
+                        <a:graphicData uri="http://schemas.microsoft.com/office/word/2010/wordprocessingShape">
+                          <wps:wsp>
+                            <wps:cNvSpPr/>
+                            <wps:spPr>
+                              <a:xfrm>
+                                <a:off x="0" y="0"/>
+                                <a:ext cx="1303020" cy="175260"/>
+                              </a:xfrm>
+                              <a:prstGeom prst="rect">
+                                <a:avLst/>
+                              </a:prstGeom>
+                              <a:solidFill>
+                                <a:schemeClr val="bg1"/>
+                              </a:solidFill>
+                              <a:ln>
+                                <a:solidFill>
+                                  <a:schemeClr val="bg1"/>
+                                </a:solidFill>
+                              </a:ln>
+                            </wps:spPr>
+                            <wps:style>
+                              <a:lnRef idx="2">
+                                <a:schemeClr val="accent6"/>
+                              </a:lnRef>
+                              <a:fillRef idx="1">
+                                <a:schemeClr val="lt1"/>
+                              </a:fillRef>
+                              <a:effectRef idx="0">
+                                <a:schemeClr val="accent6"/>
+                              </a:effectRef>
+                              <a:fontRef idx="minor">
+                                <a:schemeClr val="dk1"/>
+                              </a:fontRef>
+                            </wps:style>
+                            <wps:bodyPr rot="0" spcFirstLastPara="0" vertOverflow="overflow" horzOverflow="overflow" vert="horz" wrap="square" lIns="91440" tIns="45720" rIns="91440" bIns="45720" numCol="1" spcCol="0" rtlCol="0" fromWordArt="0" anchor="ctr" anchorCtr="0" forceAA="0" compatLnSpc="1">
+                              <a:prstTxWarp prst="textNoShape">
+                                <a:avLst/>
+                              </a:prstTxWarp>
+                              <a:noAutofit/>
+                            </wps:bodyPr>
+                          </wps:wsp>
+                        </a:graphicData>
+                      </a:graphic>
+                    </wp:anchor>
+                  </w:drawing>
+                </mc:Choice>
+                <mc:Fallback>
+                  <w:pict>
+                    <v:rect w14:anchorId="7EC45DCC" id="Rectángulo 2" o:spid="_x0000_s1026" style="position:absolute;margin-left:312pt;margin-top:242.3pt;width:102.6pt;height:13.8pt;z-index:251660288;visibility:visible;mso-wrap-style:square;mso-wrap-distance-left:9pt;mso-wrap-distance-top:0;mso-wrap-distance-right:9pt;mso-wrap-distance-bottom:0;mso-position-horizontal:absolute;mso-position-horizontal-relative:text;mso-position-vertical:absolute;mso-position-vertical-relative:text;v-text-anchor:middle" o:gfxdata="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" fillcolor="white [3212]" strokecolor="white [3212]" strokeweight="1.5pt"/>
+                  </w:pict>
+                </mc:Fallback>
+              </mc:AlternateContent>
+            </w:r>
+            <w:r>
+              <w:rPr>
+                <w:noProof/>
+              </w:rPr>
               <w:drawing>
                 <wp:inline distT="0" distB="0" distL="0" distR="0" wp14:anchorId="66803229" wp14:editId="5F11468E">
                   <wp:extent cx="6332220" cy="4148455"/>
@@ -1997,7 +2083,33 @@
               <w:rPr>
                 <w:lang w:val="es-PE"/>
               </w:rPr>
-              <w:t>Al actualizar cualquier campo de la publicación y se hace Click en “Guardar” el sistema muestra un mensaje de “Cambios guardados y actualizados correctamente” y redirige a Home</w:t>
+              <w:t>Al actualizar cualquier campo de la publicación</w:t>
+            </w:r>
+            <w:r>
+              <w:rPr>
+                <w:lang w:val="es-PE"/>
+              </w:rPr>
+              <w:t>, se habilita el botón “Guardar”</w:t>
+            </w:r>
+            <w:r>
+              <w:rPr>
+                <w:lang w:val="es-PE"/>
+              </w:rPr>
+              <w:t xml:space="preserve"> y se hace Click </w:t>
+            </w:r>
+            <w:r>
+              <w:rPr>
+                <w:b/>
+                <w:bCs/>
+                <w:lang w:val="es-PE"/>
+              </w:rPr>
+              <w:t>en “Guardar”</w:t>
+            </w:r>
+            <w:r>
+              <w:rPr>
+                <w:lang w:val="es-PE"/>
+              </w:rPr>
+              <w:t xml:space="preserve"> el sistema muestra un mensaje de “Cambios guardados y actualizados correctamente” y redirige a Home</w:t>
             </w:r>
           </w:p>
         </w:tc>
@@ -2055,7 +2167,13 @@
               <w:rPr>
                 <w:lang w:val="es-PE"/>
               </w:rPr>
-              <w:t>El ingresar a la interfaz de edición de publicaciones y no realizar ningún cambio, el botón “Guardar” no se habilitará y el sistema informara con un mensaje no invasivo “No se detectaron cambios”</w:t>
+              <w:t>El ingresar a la interfaz de edición de publicaciones y no realizar ningún cambio, el botón “Guardar” no se habilitará</w:t>
+            </w:r>
+            <w:r>
+              <w:rPr>
+                <w:lang w:val="es-PE"/>
+              </w:rPr>
+              <w:t xml:space="preserve"> y el color de fondo del botón cambia.</w:t>
             </w:r>
           </w:p>
         </w:tc>
@@ -2615,6 +2733,9 @@
               </mc:AlternateContent>
             </w:r>
             <w:r>
+              <w:rPr>
+                <w:noProof/>
+              </w:rPr>
               <w:drawing>
                 <wp:inline distT="0" distB="0" distL="0" distR="0" wp14:anchorId="1E49604D" wp14:editId="00002612">
                   <wp:extent cx="6332220" cy="4041775"/>
@@ -2829,6 +2950,32 @@
               </w:rPr>
               <w:t>.</w:t>
             </w:r>
+            <w:r>
+              <w:rPr>
+                <w:lang w:val="es-PE"/>
+              </w:rPr>
+              <w:t xml:space="preserve"> </w:t>
+            </w:r>
+            <w:r>
+              <w:rPr>
+                <w:lang w:val="es-PE"/>
+              </w:rPr>
+              <w:t xml:space="preserve">El modal de confirmación aparece </w:t>
+            </w:r>
+            <w:r>
+              <w:rPr>
+                <w:b/>
+                <w:bCs/>
+                <w:lang w:val="es-PE"/>
+              </w:rPr>
+              <w:t>y se presiona “SI”</w:t>
+            </w:r>
+            <w:r>
+              <w:rPr>
+                <w:lang w:val="es-PE"/>
+              </w:rPr>
+              <w:t xml:space="preserve"> entonces el sistema elimina la publicación de todos los registros en base de datos y confirma al usuario con un mensaje “Publicación eliminada correctamente”</w:t>
+            </w:r>
           </w:p>
         </w:tc>
       </w:tr>
@@ -2854,6 +3001,7 @@
               <w:jc w:val="center"/>
             </w:pPr>
             <w:r>
+              <w:lastRenderedPageBreak/>
               <w:t>2</w:t>
             </w:r>
           </w:p>
@@ -2885,7 +3033,55 @@
               <w:rPr>
                 <w:lang w:val="es-PE"/>
               </w:rPr>
-              <w:t>El modal de confirmación aparece y se presiona “SI” entonces el sistema elimina la publicación de todos los registros en base de datos y confirma al usuario con un mensaje “Publicación eliminada correctamente”</w:t>
+              <w:t>Al seleccionar un ítem de la tabla y abrir las acciones, se presiona “Eliminar” el sistema muestra un mensaje de confirmación si está segura de eliminar</w:t>
+            </w:r>
+            <w:r>
+              <w:rPr>
+                <w:lang w:val="es-PE"/>
+              </w:rPr>
+              <w:t xml:space="preserve">. </w:t>
+            </w:r>
+            <w:r>
+              <w:rPr>
+                <w:lang w:val="es-PE"/>
+              </w:rPr>
+              <w:t xml:space="preserve">El modal de confirmación aparece </w:t>
+            </w:r>
+            <w:r>
+              <w:rPr>
+                <w:b/>
+                <w:bCs/>
+                <w:lang w:val="es-PE"/>
+              </w:rPr>
+              <w:t>y se presiona “</w:t>
+            </w:r>
+            <w:r>
+              <w:rPr>
+                <w:b/>
+                <w:bCs/>
+                <w:lang w:val="es-PE"/>
+              </w:rPr>
+              <w:t>NO</w:t>
+            </w:r>
+            <w:r>
+              <w:rPr>
+                <w:b/>
+                <w:bCs/>
+                <w:lang w:val="es-PE"/>
+              </w:rPr>
+              <w:t>”</w:t>
+            </w:r>
+            <w:r>
+              <w:rPr>
+                <w:lang w:val="es-PE"/>
+              </w:rPr>
+              <w:t xml:space="preserve"> entonces el sistema</w:t>
+            </w:r>
+            <w:r>
+              <w:rPr>
+                <w:lang w:val="es-PE"/>
+              </w:rPr>
+              <w:t xml:space="preserve"> cerrara todos los modales en pantalla.</w:t>
             </w:r>
           </w:p>
         </w:tc>
@@ -2924,7 +3120,6 @@
                 <w:sz w:val="22"/>
                 <w:szCs w:val="22"/>
               </w:rPr>
-              <w:lastRenderedPageBreak/>
               <w:t>Titulo</w:t>
             </w:r>
             <w:proofErr w:type="spellEnd"/>
@@ -3073,7 +3268,7 @@
         </w:tc>
         <w:tc>
           <w:tcPr>
-            <w:tcW w:w="1841" w:type="dxa"/>
+            <w:tcW w:w="1842" w:type="dxa"/>
             <w:gridSpan w:val="2"/>
             <w:tcBorders>
               <w:top w:val="single" w:sz="4" w:space="0" w:color="000000"/>
@@ -3108,7 +3303,7 @@
       <w:tr>
         <w:tc>
           <w:tcPr>
-            <w:tcW w:w="10670" w:type="dxa"/>
+            <w:tcW w:w="10671" w:type="dxa"/>
             <w:gridSpan w:val="11"/>
             <w:tcBorders>
               <w:top w:val="single" w:sz="4" w:space="0" w:color="000000"/>
@@ -3156,7 +3351,7 @@
       <w:tr>
         <w:tc>
           <w:tcPr>
-            <w:tcW w:w="10670" w:type="dxa"/>
+            <w:tcW w:w="10671" w:type="dxa"/>
             <w:gridSpan w:val="11"/>
             <w:tcBorders>
               <w:top w:val="single" w:sz="4" w:space="0" w:color="000000"/>
@@ -3194,7 +3389,7 @@
         </w:trPr>
         <w:tc>
           <w:tcPr>
-            <w:tcW w:w="10670" w:type="dxa"/>
+            <w:tcW w:w="10671" w:type="dxa"/>
             <w:gridSpan w:val="11"/>
             <w:tcBorders>
               <w:top w:val="single" w:sz="4" w:space="0" w:color="000000"/>
@@ -3214,6 +3409,9 @@
               <w:jc w:val="center"/>
             </w:pPr>
             <w:r>
+              <w:rPr>
+                <w:noProof/>
+              </w:rPr>
               <w:drawing>
                 <wp:inline distT="0" distB="0" distL="0" distR="0" wp14:anchorId="162144AD" wp14:editId="1554554D">
                   <wp:extent cx="6332220" cy="4862830"/>
@@ -3256,6 +3454,9 @@
               <w:jc w:val="center"/>
             </w:pPr>
             <w:r>
+              <w:rPr>
+                <w:noProof/>
+              </w:rPr>
               <w:lastRenderedPageBreak/>
               <w:drawing>
                 <wp:inline distT="0" distB="0" distL="0" distR="0" wp14:anchorId="073CEF1E" wp14:editId="47AE0A65">
@@ -3299,7 +3500,7 @@
       <w:tr>
         <w:tc>
           <w:tcPr>
-            <w:tcW w:w="10670" w:type="dxa"/>
+            <w:tcW w:w="10671" w:type="dxa"/>
             <w:gridSpan w:val="11"/>
             <w:tcBorders>
               <w:top w:val="single" w:sz="4" w:space="0" w:color="000000"/>
@@ -3383,7 +3584,7 @@
         </w:tc>
         <w:tc>
           <w:tcPr>
-            <w:tcW w:w="9611" w:type="dxa"/>
+            <w:tcW w:w="9612" w:type="dxa"/>
             <w:gridSpan w:val="9"/>
             <w:tcBorders>
               <w:top w:val="single" w:sz="4" w:space="0" w:color="000000"/>
@@ -3408,21 +3609,7 @@
               <w:rPr>
                 <w:lang w:val="es-PE"/>
               </w:rPr>
-              <w:t xml:space="preserve">Al ingresar a la página Home, se listan automáticamente todas las publicaciones disponibles con imagen y fecha de la </w:t>
-            </w:r>
-            <w:proofErr w:type="spellStart"/>
-            <w:r>
-              <w:rPr>
-                <w:lang w:val="es-PE"/>
-              </w:rPr>
-              <w:t>mas</w:t>
-            </w:r>
-            <w:proofErr w:type="spellEnd"/>
-            <w:r>
-              <w:rPr>
-                <w:lang w:val="es-PE"/>
-              </w:rPr>
-              <w:t xml:space="preserve"> reciente a la más antigua</w:t>
+              <w:t>Al ingresar a la página Home, se listan automáticamente todas las publicaciones disponibles con imagen y fecha de la más reciente a la más antigua</w:t>
             </w:r>
           </w:p>
         </w:tc>
@@ -3456,7 +3643,7 @@
         </w:tc>
         <w:tc>
           <w:tcPr>
-            <w:tcW w:w="9611" w:type="dxa"/>
+            <w:tcW w:w="9612" w:type="dxa"/>
             <w:gridSpan w:val="9"/>
             <w:tcBorders>
               <w:top w:val="single" w:sz="4" w:space="0" w:color="000000"/>
@@ -3954,6 +4141,9 @@
               </w:rPr>
             </w:pPr>
             <w:r>
+              <w:rPr>
+                <w:noProof/>
+              </w:rPr>
               <w:drawing>
                 <wp:inline distT="0" distB="0" distL="0" distR="0" wp14:anchorId="3591BDD2" wp14:editId="332BE0D4">
                   <wp:extent cx="6332220" cy="4129405"/>
@@ -4103,7 +4293,55 @@
               <w:rPr>
                 <w:lang w:val="es-PE"/>
               </w:rPr>
-              <w:t>En la pantalla home, al presionar “DOBLE CLICK” en el card de publicación entonces el sistema muestra más detalle de la publicación y redirige a una vista más detallada.</w:t>
+              <w:t xml:space="preserve">En la pantalla </w:t>
+            </w:r>
+            <w:r>
+              <w:rPr>
+                <w:lang w:val="es-PE"/>
+              </w:rPr>
+              <w:t>Post</w:t>
+            </w:r>
+            <w:r>
+              <w:rPr>
+                <w:lang w:val="es-PE"/>
+              </w:rPr>
+              <w:t>, al presionar “DOBLE CLICK” en el card de publicación entonces el sistema muestra más detalle de la publicación y redirige a una vista más detallada.</w:t>
+            </w:r>
+            <w:r>
+              <w:rPr>
+                <w:lang w:val="es-PE"/>
+              </w:rPr>
+              <w:t xml:space="preserve"> </w:t>
+            </w:r>
+            <w:r>
+              <w:rPr>
+                <w:lang w:val="es-PE"/>
+              </w:rPr>
+              <w:t xml:space="preserve">Al ingresar a la pantalla más detalle de publicación, </w:t>
+            </w:r>
+            <w:r>
+              <w:rPr>
+                <w:lang w:val="es-PE"/>
+              </w:rPr>
+              <w:t xml:space="preserve">el sistema </w:t>
+            </w:r>
+            <w:r>
+              <w:rPr>
+                <w:lang w:val="es-PE"/>
+              </w:rPr>
+              <w:t xml:space="preserve">lista </w:t>
+            </w:r>
+            <w:r>
+              <w:rPr>
+                <w:lang w:val="es-PE"/>
+              </w:rPr>
+              <w:t xml:space="preserve">los datos de </w:t>
+            </w:r>
+            <w:r>
+              <w:rPr>
+                <w:lang w:val="es-PE"/>
+              </w:rPr>
+              <w:t>la publicación seleccionada y el usuario que la creo</w:t>
             </w:r>
           </w:p>
         </w:tc>
@@ -4162,7 +4400,13 @@
               <w:rPr>
                 <w:lang w:val="es-PE"/>
               </w:rPr>
-              <w:t>Al ingresar a la pantalla más detalle de publicación, se lista la publicación seleccionada y el usuario que la creo</w:t>
+              <w:t xml:space="preserve">Al ingresar a la pantalla </w:t>
+            </w:r>
+            <w:r>
+              <w:rPr>
+                <w:lang w:val="es-PE"/>
+              </w:rPr>
+              <w:t>Post y solo se hace “Un Click” en el card de la publicación entonces el sistema solo marca el con un borde a el Card seleccionado.</w:t>
             </w:r>
           </w:p>
         </w:tc>

</xml_diff>